<commit_message>
update and readme report
</commit_message>
<xml_diff>
--- a/Звіт.docx
+++ b/Звіт.docx
@@ -82,7 +82,7 @@
                     </pic:cNvPicPr>
                   </pic:nvPicPr>
                   <pic:blipFill>
-                    <a:blip r:embed="rId4" cstate="print">
+                    <a:blip r:embed="rId5" cstate="print">
                       <a:extLst>
                         <a:ext uri="{28A0092B-C50C-407E-A947-70E740481C1C}">
                           <a14:useLocalDpi xmlns:a14="http://schemas.microsoft.com/office/drawing/2010/main" val="0"/>
@@ -222,10 +222,7 @@
         <w:jc w:val="right"/>
       </w:pPr>
       <w:r>
-        <w:t>І</w:t>
-      </w:r>
-      <w:r>
-        <w:t xml:space="preserve">нженерія програмного </w:t>
+        <w:t xml:space="preserve">Інженерія програмного </w:t>
       </w:r>
     </w:p>
     <w:p>
@@ -308,27 +305,289 @@
     <w:p>
       <w:pPr>
         <w:jc w:val="center"/>
+      </w:pPr>
+      <w:r>
+        <w:t xml:space="preserve">Київ </w:t>
+      </w:r>
+      <w:r>
+        <w:t>–</w:t>
+      </w:r>
+      <w:r>
+        <w:t xml:space="preserve"> 2026</w:t>
+      </w:r>
+    </w:p>
+    <w:p>
+      <w:pPr>
+        <w:pStyle w:val="a7"/>
+        <w:numPr>
+          <w:ilvl w:val="0"/>
+          <w:numId w:val="1"/>
+        </w:numPr>
+        <w:jc w:val="center"/>
+      </w:pPr>
+      <w:r>
+        <w:lastRenderedPageBreak/>
+        <w:t>Постановка задачі</w:t>
+      </w:r>
+    </w:p>
+    <w:p>
+      <w:pPr>
+        <w:ind w:left="360"/>
+      </w:pPr>
+      <w:r>
+        <w:t xml:space="preserve">Метою проєкту було створити систему електронного реєстру Університету, с можливістю управління з консольного інтерфейсу, яка буде показувати знання курсу </w:t>
+      </w:r>
+      <w:r>
         <w:rPr>
           <w:lang w:val="en-US"/>
         </w:rPr>
-      </w:pPr>
-      <w:r>
-        <w:t xml:space="preserve">Київ </w:t>
-      </w:r>
-      <w:r>
-        <w:t>–</w:t>
-      </w:r>
-      <w:r>
-        <w:t xml:space="preserve"> 2026</w:t>
-      </w:r>
-    </w:p>
-    <w:p>
-      <w:pPr>
+        <w:t>Advanced</w:t>
+      </w:r>
+      <w:r>
+        <w:t xml:space="preserve"> </w:t>
+      </w:r>
+      <w:r>
+        <w:rPr>
+          <w:lang w:val="en-US"/>
+        </w:rPr>
+        <w:t>Java</w:t>
+      </w:r>
+      <w:r>
+        <w:t>.</w:t>
+      </w:r>
+    </w:p>
+    <w:p>
+      <w:pPr>
+        <w:pStyle w:val="a7"/>
+      </w:pPr>
+      <w:r>
+        <w:t xml:space="preserve"> </w:t>
+      </w:r>
+    </w:p>
+    <w:p>
+      <w:pPr>
+        <w:pStyle w:val="a7"/>
+        <w:numPr>
+          <w:ilvl w:val="0"/>
+          <w:numId w:val="1"/>
+        </w:numPr>
         <w:jc w:val="center"/>
+      </w:pPr>
+      <w:r>
+        <w:t>Розподіл ролей</w:t>
+      </w:r>
+    </w:p>
+    <w:p>
+      <w:r>
+        <w:t>Волощенко Артем:</w:t>
+      </w:r>
+    </w:p>
+    <w:p>
+      <w:pPr>
+        <w:ind w:firstLine="708"/>
         <w:rPr>
           <w:lang w:val="en-US"/>
         </w:rPr>
       </w:pPr>
+      <w:r>
+        <w:t xml:space="preserve">Відповідальний за логіку проекту, більшість пошукових та сортувальних операцій, створеннях власних помилок та налаштування системи логування за допомогою </w:t>
+      </w:r>
+      <w:r>
+        <w:rPr>
+          <w:lang w:val="en-US"/>
+        </w:rPr>
+        <w:t>SLF</w:t>
+      </w:r>
+      <w:r>
+        <w:t>4</w:t>
+      </w:r>
+      <w:r>
+        <w:rPr>
+          <w:lang w:val="en-US"/>
+        </w:rPr>
+        <w:t>J</w:t>
+      </w:r>
+      <w:r>
+        <w:t xml:space="preserve"> + </w:t>
+      </w:r>
+      <w:r>
+        <w:rPr>
+          <w:lang w:val="en-US"/>
+        </w:rPr>
+        <w:t>Log</w:t>
+      </w:r>
+      <w:r>
+        <w:t>4</w:t>
+      </w:r>
+      <w:r>
+        <w:rPr>
+          <w:lang w:val="en-US"/>
+        </w:rPr>
+        <w:t>J</w:t>
+      </w:r>
+      <w:r>
+        <w:t>2</w:t>
+      </w:r>
+      <w:r>
+        <w:t xml:space="preserve">. Також реалізував імпорт/експорт у </w:t>
+      </w:r>
+      <w:r>
+        <w:t>.</w:t>
+      </w:r>
+      <w:r>
+        <w:rPr>
+          <w:lang w:val="en-US"/>
+        </w:rPr>
+        <w:t>json</w:t>
+      </w:r>
+      <w:r>
+        <w:t xml:space="preserve"> файл та написав тестування на </w:t>
+      </w:r>
+      <w:r>
+        <w:rPr>
+          <w:lang w:val="en-US"/>
+        </w:rPr>
+        <w:t>JUnit</w:t>
+      </w:r>
+      <w:r>
+        <w:t xml:space="preserve">. </w:t>
+      </w:r>
+    </w:p>
+    <w:p>
+      <w:r>
+        <w:t xml:space="preserve">Ображей Олександр: </w:t>
+      </w:r>
+    </w:p>
+    <w:p>
+      <w:r>
+        <w:tab/>
+        <w:t xml:space="preserve">Реалізував мережевий </w:t>
+      </w:r>
+      <w:r>
+        <w:rPr>
+          <w:lang w:val="en-US"/>
+        </w:rPr>
+        <w:t>TCP</w:t>
+      </w:r>
+      <w:r>
+        <w:t xml:space="preserve"> клієнт для </w:t>
+      </w:r>
+      <w:r>
+        <w:t xml:space="preserve">бездротового з'єднання, </w:t>
+      </w:r>
+    </w:p>
+    <w:p>
+      <w:pPr>
+        <w:pStyle w:val="a7"/>
+        <w:numPr>
+          <w:ilvl w:val="0"/>
+          <w:numId w:val="1"/>
+        </w:numPr>
+        <w:jc w:val="center"/>
+      </w:pPr>
+      <w:r>
+        <w:t>Опис можливостей</w:t>
+      </w:r>
+    </w:p>
+    <w:p>
+      <w:pPr>
+        <w:ind w:left="360" w:firstLine="348"/>
+      </w:pPr>
+      <w:r>
+        <w:t>Безпе</w:t>
+      </w:r>
+      <w:r>
+        <w:t xml:space="preserve">чний </w:t>
+      </w:r>
+      <w:r>
+        <w:t>доступ: Захищений вхід</w:t>
+      </w:r>
+      <w:r>
+        <w:t xml:space="preserve"> з логіном і паролем, та можливістю</w:t>
+      </w:r>
+      <w:r>
+        <w:t xml:space="preserve"> блокува</w:t>
+      </w:r>
+      <w:r>
+        <w:t xml:space="preserve">ти зайвих </w:t>
+      </w:r>
+      <w:r>
+        <w:t xml:space="preserve">користувачів. </w:t>
+      </w:r>
+      <w:r>
+        <w:t>Звичайні к</w:t>
+      </w:r>
+      <w:r>
+        <w:t>ористувачі мають доступ лише до звітів</w:t>
+      </w:r>
+      <w:r>
+        <w:t xml:space="preserve"> та пошуків, </w:t>
+      </w:r>
+      <w:r>
+        <w:t xml:space="preserve">Менеджери </w:t>
+      </w:r>
+      <w:r>
+        <w:t xml:space="preserve">ж </w:t>
+      </w:r>
+      <w:r>
+        <w:t>можуть керувати даними</w:t>
+      </w:r>
+      <w:r>
+        <w:t>, а</w:t>
+      </w:r>
+      <w:r>
+        <w:t xml:space="preserve"> Адміністратори </w:t>
+      </w:r>
+      <w:r>
+        <w:t xml:space="preserve">можуть </w:t>
+      </w:r>
+      <w:r>
+        <w:t>керу</w:t>
+      </w:r>
+      <w:r>
+        <w:t>вати</w:t>
+      </w:r>
+      <w:r>
+        <w:t xml:space="preserve"> системою та </w:t>
+      </w:r>
+      <w:r>
+        <w:t xml:space="preserve">іншими </w:t>
+      </w:r>
+      <w:r>
+        <w:t>користувачами.</w:t>
+      </w:r>
+    </w:p>
+    <w:p>
+      <w:pPr>
+        <w:ind w:left="360"/>
+      </w:pPr>
+      <w:r>
+        <w:t xml:space="preserve">    Керування структурою: Створення факультетів, кафедр, прив'язка завідувачів та деканів.</w:t>
+      </w:r>
+    </w:p>
+    <w:p>
+      <w:pPr>
+        <w:ind w:left="360"/>
+      </w:pPr>
+      <w:r>
+        <w:t xml:space="preserve">    Каскадне видалення: Реалізовано безпечне видалення факультетів та кафедр (разом із автоматичним видаленням усіх пов'язаних викладачів та студентів із запитом на підтвердження).</w:t>
+      </w:r>
+    </w:p>
+    <w:p>
+      <w:pPr>
+        <w:ind w:left="360"/>
+      </w:pPr>
+      <w:r>
+        <w:t xml:space="preserve">    Сортування та фільтрація (Stream API): 9 унікальних алгоритмів сортування, включаючи складне групування студентів та викладачів по кафедрах в алфавітному порядку.</w:t>
+      </w:r>
+    </w:p>
+    <w:p>
+      <w:pPr>
+        <w:ind w:left="360"/>
+      </w:pPr>
+      <w:r>
+        <w:t xml:space="preserve">    Фонове автозбереження: Дані автоматично серіалізуються у JSON кожні 60 секунд за допомогою потоку-демона (Daemon Thread).</w:t>
+      </w:r>
     </w:p>
     <w:sectPr>
       <w:pgSz w:w="11906" w:h="16838"/>
@@ -338,6 +597,103 @@
     </w:sectPr>
   </w:body>
 </w:document>
+</file>
+
+<file path=word/numbering.xml><?xml version="1.0" encoding="utf-8"?>
+<w:numbering xmlns:wpc="http://schemas.microsoft.com/office/word/2010/wordprocessingCanvas" xmlns:cx="http://schemas.microsoft.com/office/drawing/2014/chartex" xmlns:cx1="http://schemas.microsoft.com/office/drawing/2015/9/8/chartex" xmlns:cx2="http://schemas.microsoft.com/office/drawing/2015/10/21/chartex" xmlns:cx3="http://schemas.microsoft.com/office/drawing/2016/5/9/chartex" xmlns:cx4="http://schemas.microsoft.com/office/drawing/2016/5/10/chartex" xmlns:cx5="http://schemas.microsoft.com/office/drawing/2016/5/11/chartex" xmlns:cx6="http://schemas.microsoft.com/office/drawing/2016/5/12/chartex" xmlns:cx7="http://schemas.microsoft.com/office/drawing/2016/5/13/chartex" xmlns:cx8="http://schemas.microsoft.com/office/drawing/2016/5/14/chartex" xmlns:mc="http://schemas.openxmlformats.org/markup-compatibility/2006" xmlns:aink="http://schemas.microsoft.com/office/drawing/2016/ink" xmlns:am3d="http://schemas.microsoft.com/office/drawing/2017/model3d" xmlns:o="urn:schemas-microsoft-com:office:office" xmlns:oel="http://schemas.microsoft.com/office/2019/extlst" xmlns:r="http://schemas.openxmlformats.org/officeDocument/2006/relationships" xmlns:m="http://schemas.openxmlformats.org/officeDocument/2006/math" xmlns:v="urn:schemas-microsoft-com:vml" xmlns:wp14="http://schemas.microsoft.com/office/word/2010/wordprocessingDrawing" xmlns:wp="http://schemas.openxmlformats.org/drawingml/2006/wordprocessingDrawing" xmlns:w10="urn:schemas-microsoft-com:office:word" xmlns:w="http://schemas.openxmlformats.org/wordprocessingml/2006/main" xmlns:w14="http://schemas.microsoft.com/office/word/2010/wordml" xmlns:w15="http://schemas.microsoft.com/office/word/2012/wordml" xmlns:w16cex="http://schemas.microsoft.com/office/word/2018/wordml/cex" xmlns:w16cid="http://schemas.microsoft.com/office/word/2016/wordml/cid" xmlns:w16="http://schemas.microsoft.com/office/word/2018/wordml" xmlns:w16du="http://schemas.microsoft.com/office/word/2023/wordml/word16du" xmlns:w16sdtdh="http://schemas.microsoft.com/office/word/2020/wordml/sdtdatahash" xmlns:w16sdtfl="http://schemas.microsoft.com/office/word/2024/wordml/sdtformatlock" xmlns:w16se="http://schemas.microsoft.com/office/word/2015/wordml/symex" xmlns:wpg="http://schemas.microsoft.com/office/word/2010/wordprocessingGroup" xmlns:wpi="http://schemas.microsoft.com/office/word/2010/wordprocessingInk" xmlns:wne="http://schemas.microsoft.com/office/word/2006/wordml" xmlns:wps="http://schemas.microsoft.com/office/word/2010/wordprocessingShape" mc:Ignorable="w14 w15 w16se w16cid w16 w16cex w16sdtdh w16sdtfl w16du wp14">
+  <w:abstractNum w:abstractNumId="0" w15:restartNumberingAfterBreak="0">
+    <w:nsid w:val="4B1E7A4C"/>
+    <w:multiLevelType w:val="hybridMultilevel"/>
+    <w:tmpl w:val="3E440890"/>
+    <w:lvl w:ilvl="0" w:tplc="2000000F">
+      <w:start w:val="1"/>
+      <w:numFmt w:val="decimal"/>
+      <w:lvlText w:val="%1."/>
+      <w:lvlJc w:val="left"/>
+      <w:pPr>
+        <w:ind w:left="720" w:hanging="360"/>
+      </w:pPr>
+      <w:rPr>
+        <w:rFonts w:hint="default"/>
+      </w:rPr>
+    </w:lvl>
+    <w:lvl w:ilvl="1" w:tplc="20000019">
+      <w:start w:val="1"/>
+      <w:numFmt w:val="lowerLetter"/>
+      <w:lvlText w:val="%2."/>
+      <w:lvlJc w:val="left"/>
+      <w:pPr>
+        <w:ind w:left="1440" w:hanging="360"/>
+      </w:pPr>
+    </w:lvl>
+    <w:lvl w:ilvl="2" w:tplc="2000001B">
+      <w:start w:val="1"/>
+      <w:numFmt w:val="lowerRoman"/>
+      <w:lvlText w:val="%3."/>
+      <w:lvlJc w:val="right"/>
+      <w:pPr>
+        <w:ind w:left="2160" w:hanging="180"/>
+      </w:pPr>
+    </w:lvl>
+    <w:lvl w:ilvl="3" w:tplc="2000000F">
+      <w:start w:val="1"/>
+      <w:numFmt w:val="decimal"/>
+      <w:lvlText w:val="%4."/>
+      <w:lvlJc w:val="left"/>
+      <w:pPr>
+        <w:ind w:left="2880" w:hanging="360"/>
+      </w:pPr>
+    </w:lvl>
+    <w:lvl w:ilvl="4" w:tplc="20000019">
+      <w:start w:val="1"/>
+      <w:numFmt w:val="lowerLetter"/>
+      <w:lvlText w:val="%5."/>
+      <w:lvlJc w:val="left"/>
+      <w:pPr>
+        <w:ind w:left="3600" w:hanging="360"/>
+      </w:pPr>
+    </w:lvl>
+    <w:lvl w:ilvl="5" w:tplc="2000001B">
+      <w:start w:val="1"/>
+      <w:numFmt w:val="lowerRoman"/>
+      <w:lvlText w:val="%6."/>
+      <w:lvlJc w:val="right"/>
+      <w:pPr>
+        <w:ind w:left="4320" w:hanging="180"/>
+      </w:pPr>
+    </w:lvl>
+    <w:lvl w:ilvl="6" w:tplc="2000000F" w:tentative="1">
+      <w:start w:val="1"/>
+      <w:numFmt w:val="decimal"/>
+      <w:lvlText w:val="%7."/>
+      <w:lvlJc w:val="left"/>
+      <w:pPr>
+        <w:ind w:left="5040" w:hanging="360"/>
+      </w:pPr>
+    </w:lvl>
+    <w:lvl w:ilvl="7" w:tplc="20000019" w:tentative="1">
+      <w:start w:val="1"/>
+      <w:numFmt w:val="lowerLetter"/>
+      <w:lvlText w:val="%8."/>
+      <w:lvlJc w:val="left"/>
+      <w:pPr>
+        <w:ind w:left="5760" w:hanging="360"/>
+      </w:pPr>
+    </w:lvl>
+    <w:lvl w:ilvl="8" w:tplc="2000001B" w:tentative="1">
+      <w:start w:val="1"/>
+      <w:numFmt w:val="lowerRoman"/>
+      <w:lvlText w:val="%9."/>
+      <w:lvlJc w:val="right"/>
+      <w:pPr>
+        <w:ind w:left="6480" w:hanging="180"/>
+      </w:pPr>
+    </w:lvl>
+  </w:abstractNum>
+  <w:num w:numId="1" w16cid:durableId="1773554576">
+    <w:abstractNumId w:val="0"/>
+  </w:num>
+</w:numbering>
 </file>
 
 <file path=word/styles.xml><?xml version="1.0" encoding="utf-8"?>

</xml_diff>